<commit_message>
Afegeix Mòduls 5 (seguretat) i 6 (operativa 24/7) + wiki ampliada
</commit_message>
<xml_diff>
--- a/book/output/BernatLab_Manual_Modul_4.docx
+++ b/book/output/BernatLab_Manual_Modul_4.docx
@@ -241,7 +241,7 @@
         <w:rPr>
           <w:color w:val="1F3A5F"/>
         </w:rPr>
-        <w:t>Capítol 33 — Què és la IA local i per què a Hort Osona</w:t>
+        <w:t>Capitol 33 — Què és la IA local i per què a Hort Osona</w:t>
       </w:r>
     </w:p>
     <w:p>
@@ -1426,7 +1426,7 @@
         <w:rPr>
           <w:color w:val="1F3A5F"/>
         </w:rPr>
-        <w:t>Capítol 34 — Ollama al Mac: instal·lació i primera conversa</w:t>
+        <w:t>Capitol 34 — Ollama al Mac: instal·lació i primera conversa</w:t>
       </w:r>
     </w:p>
     <w:p>
@@ -3328,7 +3328,7 @@
         <w:rPr>
           <w:color w:val="1F3A5F"/>
         </w:rPr>
-        <w:t>Capítol 35 — Com triar el millor model</w:t>
+        <w:t>Capitol 35 — Com triar el millor model: mida, velocitat, qualitat, català</w:t>
       </w:r>
     </w:p>
     <w:p>
@@ -6135,7 +6135,7 @@
         <w:rPr>
           <w:color w:val="1F3A5F"/>
         </w:rPr>
-        <w:t>Capítol 36 — Embeddings i bases vectorials</w:t>
+        <w:t>Capitol 36 — Embeddings i bases vectorials</w:t>
       </w:r>
     </w:p>
     <w:p>
@@ -9060,7 +9060,7 @@
         <w:rPr>
           <w:color w:val="1F3A5F"/>
         </w:rPr>
-        <w:t>Capítol 37 — RAG pas a pas amb les 76 fitxes d'hort</w:t>
+        <w:t>Capitol 37 — RAG pas a pas: carregar les 76 fitxes d'hort a Ollama</w:t>
       </w:r>
     </w:p>
     <w:p>
@@ -12735,7 +12735,7 @@
         <w:rPr>
           <w:color w:val="1F3A5F"/>
         </w:rPr>
-        <w:t>Capítol 38 — Client web per parlar amb l'assistent</w:t>
+        <w:t>Capitol 38 — Client web</w:t>
       </w:r>
     </w:p>
     <w:p>
@@ -18910,7 +18910,7 @@
         <w:rPr>
           <w:color w:val="1F3A5F"/>
         </w:rPr>
-        <w:t>Capítol 39 — API d'Ollama: integrar la IA amb el BernatLab</w:t>
+        <w:t>Capitol 39 — API d'Ollama: integrar la IA amb el BernatLab</w:t>
       </w:r>
     </w:p>
     <w:p>
@@ -22730,7 +22730,7 @@
         <w:rPr>
           <w:color w:val="1F3A5F"/>
         </w:rPr>
-        <w:t>Capítol 40 — Veu: parlar a l'assistent en lloc d'escriure</w:t>
+        <w:t>Capitol 40 — Veu: parlar a l'assistent</w:t>
       </w:r>
     </w:p>
     <w:p>
@@ -26154,7 +26154,7 @@
         <w:rPr>
           <w:color w:val="1F3A5F"/>
         </w:rPr>
-        <w:t>Capítol 41 — Privadesa i bones pràctiques</w:t>
+        <w:t>Capitol 41 — Privadesa i bones pràctiques</w:t>
       </w:r>
     </w:p>
     <w:p>

</xml_diff>